<commit_message>
updating my weekly logs and proposal document
</commit_message>
<xml_diff>
--- a/Proposal working/Project Objective Olivia Hey.docx
+++ b/Proposal working/Project Objective Olivia Hey.docx
@@ -20,6 +20,311 @@
       </w:r>
     </w:p>
     <w:p/>
+    <w:p>
+      <w:r>
+        <w:t>This section of the report generally outlines the why of your project.</w:t>
+      </w:r>
+    </w:p>
+    <w:p/>
+    <w:p>
+      <w:pPr>
+        <w:pStyle w:val="Heading2"/>
+      </w:pPr>
+      <w:r>
+        <w:t>Background to the client and problem they want solved</w:t>
+      </w:r>
+    </w:p>
+    <w:p>
+      <w:r>
+        <w:t xml:space="preserve">Very briefly describe who the client is, </w:t>
+      </w:r>
+      <w:r>
+        <w:rPr>
+          <w:highlight w:val="yellow"/>
+        </w:rPr>
+        <w:t>and briefly discuss the key problem they want solved.</w:t>
+      </w:r>
+    </w:p>
+    <w:p/>
+    <w:p>
+      <w:r>
+        <w:t xml:space="preserve">The client for this project is </w:t>
+      </w:r>
+      <w:r>
+        <w:t xml:space="preserve">Geoff </w:t>
+      </w:r>
+      <w:r>
+        <w:t>Gordon</w:t>
+      </w:r>
+      <w:r>
+        <w:t xml:space="preserve"> who is a </w:t>
+      </w:r>
+      <w:r>
+        <w:t xml:space="preserve">Network Administrator for </w:t>
+      </w:r>
+      <w:proofErr w:type="spellStart"/>
+      <w:r>
+        <w:t>W</w:t>
+      </w:r>
+      <w:r>
+        <w:t>elTec</w:t>
+      </w:r>
+      <w:proofErr w:type="spellEnd"/>
+      <w:r>
+        <w:t xml:space="preserve"> and Whitireia</w:t>
+      </w:r>
+      <w:r>
+        <w:t>, a local Polytech</w:t>
+      </w:r>
+      <w:r>
+        <w:t xml:space="preserve">nic </w:t>
+      </w:r>
+      <w:r>
+        <w:t>that</w:t>
+      </w:r>
+      <w:r>
+        <w:t xml:space="preserve"> is </w:t>
+      </w:r>
+      <w:r>
+        <w:t xml:space="preserve">a subsidiary of </w:t>
+      </w:r>
+      <w:proofErr w:type="spellStart"/>
+      <w:r>
+        <w:t>Te</w:t>
+      </w:r>
+      <w:proofErr w:type="spellEnd"/>
+      <w:r>
+        <w:t xml:space="preserve"> </w:t>
+      </w:r>
+      <w:proofErr w:type="spellStart"/>
+      <w:r>
+        <w:t>Pūkenga</w:t>
+      </w:r>
+      <w:proofErr w:type="spellEnd"/>
+      <w:r>
+        <w:t xml:space="preserve"> – New Zealand</w:t>
+      </w:r>
+      <w:r>
+        <w:t>’s</w:t>
+      </w:r>
+      <w:r>
+        <w:t xml:space="preserve"> Institute of Skills and Technology</w:t>
+      </w:r>
+      <w:r>
+        <w:t xml:space="preserve">. Geoff </w:t>
+      </w:r>
+      <w:r>
+        <w:t>offers technical s</w:t>
+      </w:r>
+      <w:r>
+        <w:t>upport</w:t>
+      </w:r>
+      <w:r>
+        <w:t xml:space="preserve"> to staff, students </w:t>
+      </w:r>
+      <w:r>
+        <w:t>and lecturers’</w:t>
+      </w:r>
+      <w:r>
+        <w:t xml:space="preserve"> and</w:t>
+      </w:r>
+      <w:r>
+        <w:t xml:space="preserve"> is</w:t>
+      </w:r>
+      <w:r>
+        <w:t xml:space="preserve"> an on-site “fix-it” man </w:t>
+      </w:r>
+      <w:r>
+        <w:t>for del</w:t>
+      </w:r>
+      <w:r>
+        <w:t xml:space="preserve">ivering </w:t>
+      </w:r>
+      <w:r>
+        <w:t xml:space="preserve">technical solutions </w:t>
+      </w:r>
+      <w:r>
+        <w:t>and help</w:t>
+      </w:r>
+      <w:r>
+        <w:t>ful ideas (</w:t>
+      </w:r>
+      <w:r>
+        <w:t xml:space="preserve">Whitireia &amp; </w:t>
+      </w:r>
+      <w:proofErr w:type="spellStart"/>
+      <w:r>
+        <w:t>Weltec</w:t>
+      </w:r>
+      <w:proofErr w:type="spellEnd"/>
+      <w:r>
+        <w:t xml:space="preserve">, </w:t>
+      </w:r>
+      <w:proofErr w:type="spellStart"/>
+      <w:r>
+        <w:t>n.d</w:t>
+      </w:r>
+      <w:proofErr w:type="spellEnd"/>
+      <w:r>
+        <w:t xml:space="preserve">). </w:t>
+      </w:r>
+    </w:p>
+    <w:p/>
+    <w:p>
+      <w:pPr>
+        <w:pStyle w:val="Heading2"/>
+      </w:pPr>
+      <w:r>
+        <w:t>Discussion of deliverables and how they relate to the problem to be</w:t>
+      </w:r>
+      <w:r>
+        <w:t xml:space="preserve"> </w:t>
+      </w:r>
+      <w:r>
+        <w:t>solved</w:t>
+      </w:r>
+    </w:p>
+    <w:p>
+      <w:r>
+        <w:rPr>
+          <w:highlight w:val="yellow"/>
+        </w:rPr>
+        <w:t>Include a discussion of the main deliverable that the client expects such as a piece of software or an</w:t>
+      </w:r>
+      <w:r>
+        <w:rPr>
+          <w:highlight w:val="yellow"/>
+        </w:rPr>
+        <w:t xml:space="preserve"> </w:t>
+      </w:r>
+      <w:r>
+        <w:rPr>
+          <w:highlight w:val="yellow"/>
+        </w:rPr>
+        <w:t>app, or research report, or audit of current resources they have or equivalent.</w:t>
+      </w:r>
+    </w:p>
+    <w:p>
+      <w:r>
+        <w:t xml:space="preserve">The main deliverable for this project will be a research report and </w:t>
+      </w:r>
+    </w:p>
+    <w:p/>
+    <w:p/>
+    <w:p>
+      <w:pPr>
+        <w:pStyle w:val="Heading2"/>
+      </w:pPr>
+      <w:r>
+        <w:t>Discussion of project must haves</w:t>
+      </w:r>
+    </w:p>
+    <w:p>
+      <w:r>
+        <w:t>As part of the project discussion, there needs to be a clear discussion of the project “must haves”.</w:t>
+      </w:r>
+    </w:p>
+    <w:p>
+      <w:r>
+        <w:t>Your Final Panel will expect clear discussion on how each of these “must haves” were met during</w:t>
+      </w:r>
+      <w:r>
+        <w:t xml:space="preserve"> </w:t>
+      </w:r>
+      <w:r>
+        <w:t>your project.</w:t>
+      </w:r>
+    </w:p>
+    <w:p/>
+    <w:p>
+      <w:pPr>
+        <w:pStyle w:val="Heading2"/>
+      </w:pPr>
+      <w:r>
+        <w:lastRenderedPageBreak/>
+        <w:t>Discussion of project nice to haves</w:t>
+      </w:r>
+    </w:p>
+    <w:p>
+      <w:r>
+        <w:t>As part of the project deliverables discussion, there needs to be a clear discussion of the project “nice</w:t>
+      </w:r>
+      <w:r>
+        <w:t xml:space="preserve"> </w:t>
+      </w:r>
+      <w:r>
+        <w:t>to haves”. These can include “stretch goals” or reasonable “big picture” items that may not necessarily</w:t>
+      </w:r>
+      <w:r>
+        <w:t xml:space="preserve"> </w:t>
+      </w:r>
+      <w:r>
+        <w:t>be delivered in the final product.</w:t>
+      </w:r>
+    </w:p>
+    <w:p/>
+    <w:p>
+      <w:pPr>
+        <w:pStyle w:val="Heading2"/>
+      </w:pPr>
+      <w:r>
+        <w:t>Scope of the project</w:t>
+      </w:r>
+    </w:p>
+    <w:p>
+      <w:r>
+        <w:t>Brief discussion of what is in scope and what is out of scope for the project.</w:t>
+      </w:r>
+    </w:p>
+    <w:p/>
+    <w:p/>
+    <w:p>
+      <w:pPr>
+        <w:pStyle w:val="Heading1"/>
+      </w:pPr>
+      <w:r>
+        <w:t>References</w:t>
+      </w:r>
+    </w:p>
+    <w:p/>
+    <w:p>
+      <w:r>
+        <w:t xml:space="preserve">Whitireia &amp; </w:t>
+      </w:r>
+      <w:proofErr w:type="spellStart"/>
+      <w:r>
+        <w:t>WelTec</w:t>
+      </w:r>
+      <w:proofErr w:type="spellEnd"/>
+      <w:r>
+        <w:t>.</w:t>
+      </w:r>
+      <w:r>
+        <w:t xml:space="preserve"> (</w:t>
+      </w:r>
+      <w:proofErr w:type="spellStart"/>
+      <w:r>
+        <w:t>n.d</w:t>
+      </w:r>
+      <w:proofErr w:type="spellEnd"/>
+      <w:r>
+        <w:t>).</w:t>
+      </w:r>
+      <w:r>
+        <w:t xml:space="preserve"> Our Staff. Retrieved from:</w:t>
+      </w:r>
+      <w:r>
+        <w:t xml:space="preserve"> </w:t>
+      </w:r>
+      <w:hyperlink r:id="rId4" w:history="1">
+        <w:r>
+          <w:rPr>
+            <w:rStyle w:val="Hyperlink"/>
+          </w:rPr>
+          <w:t>https://www.whitireiaweltec.ac.nz/about-us/staff-profiles</w:t>
+        </w:r>
+      </w:hyperlink>
+    </w:p>
     <w:p/>
     <w:p/>
     <w:p/>
@@ -461,7 +766,6 @@
     <w:next w:val="Normal"/>
     <w:link w:val="Heading2Char"/>
     <w:uiPriority w:val="9"/>
-    <w:semiHidden/>
     <w:unhideWhenUsed/>
     <w:qFormat/>
     <w:rsid w:val="00D25F67"/>
@@ -636,7 +940,6 @@
   <w:style w:type="character" w:default="1" w:styleId="DefaultParagraphFont">
     <w:name w:val="Default Paragraph Font"/>
     <w:uiPriority w:val="1"/>
-    <w:semiHidden/>
     <w:unhideWhenUsed/>
   </w:style>
   <w:style w:type="table" w:default="1" w:styleId="TableNormal">
@@ -678,7 +981,6 @@
     <w:basedOn w:val="DefaultParagraphFont"/>
     <w:link w:val="Heading2"/>
     <w:uiPriority w:val="9"/>
-    <w:semiHidden/>
     <w:rsid w:val="00D25F67"/>
     <w:rPr>
       <w:rFonts w:asciiTheme="majorHAnsi" w:eastAsiaTheme="majorEastAsia" w:hAnsiTheme="majorHAnsi" w:cstheme="majorBidi"/>
@@ -948,6 +1250,29 @@
       <w:smallCaps/>
       <w:color w:val="0F4761" w:themeColor="accent1" w:themeShade="BF"/>
       <w:spacing w:val="5"/>
+    </w:rPr>
+  </w:style>
+  <w:style w:type="character" w:styleId="Hyperlink">
+    <w:name w:val="Hyperlink"/>
+    <w:basedOn w:val="DefaultParagraphFont"/>
+    <w:uiPriority w:val="99"/>
+    <w:unhideWhenUsed/>
+    <w:rsid w:val="00854BDF"/>
+    <w:rPr>
+      <w:color w:val="467886" w:themeColor="hyperlink"/>
+      <w:u w:val="single"/>
+    </w:rPr>
+  </w:style>
+  <w:style w:type="character" w:styleId="UnresolvedMention">
+    <w:name w:val="Unresolved Mention"/>
+    <w:basedOn w:val="DefaultParagraphFont"/>
+    <w:uiPriority w:val="99"/>
+    <w:semiHidden/>
+    <w:unhideWhenUsed/>
+    <w:rsid w:val="00854BDF"/>
+    <w:rPr>
+      <w:color w:val="605E5C"/>
+      <w:shd w:val="clear" w:color="auto" w:fill="E1DFDD"/>
     </w:rPr>
   </w:style>
 </w:styles>

</xml_diff>

<commit_message>
Updating my proposal document with Project Objctive work
</commit_message>
<xml_diff>
--- a/Proposal working/Project Objective Olivia Hey.docx
+++ b/Proposal working/Project Objective Olivia Hey.docx
@@ -36,13 +36,18 @@
     </w:p>
     <w:p>
       <w:r>
-        <w:t xml:space="preserve">Very briefly describe who the client is, </w:t>
-      </w:r>
-      <w:r>
-        <w:rPr>
-          <w:highlight w:val="yellow"/>
-        </w:rPr>
-        <w:t>and briefly discuss the key problem they want solved.</w:t>
+        <w:t xml:space="preserve">Very briefly describe who the client </w:t>
+      </w:r>
+      <w:proofErr w:type="gramStart"/>
+      <w:r>
+        <w:t xml:space="preserve">is, </w:t>
+      </w:r>
+      <w:r>
+        <w:t>and</w:t>
+      </w:r>
+      <w:proofErr w:type="gramEnd"/>
+      <w:r>
+        <w:t xml:space="preserve"> briefly discuss the key problem they want solved.</w:t>
       </w:r>
     </w:p>
     <w:p/>
@@ -167,6 +172,39 @@
       <w:proofErr w:type="spellEnd"/>
       <w:r>
         <w:t xml:space="preserve">). </w:t>
+      </w:r>
+    </w:p>
+    <w:p/>
+    <w:p>
+      <w:r>
+        <w:t xml:space="preserve">The key problem they would like solved is </w:t>
+      </w:r>
+      <w:r>
+        <w:t xml:space="preserve">the comparison </w:t>
+      </w:r>
+      <w:r>
+        <w:t>of traditional</w:t>
+      </w:r>
+      <w:r>
+        <w:t xml:space="preserve"> forensic tools to </w:t>
+      </w:r>
+      <w:r>
+        <w:t xml:space="preserve">AI versions of forensic tools so that we may </w:t>
+      </w:r>
+      <w:r>
+        <w:t xml:space="preserve">develop an analysis of whether or not AI is </w:t>
+      </w:r>
+      <w:r>
+        <w:t xml:space="preserve">a </w:t>
+      </w:r>
+      <w:r>
+        <w:t xml:space="preserve">worthwhile </w:t>
+      </w:r>
+      <w:r>
+        <w:t>venture f</w:t>
+      </w:r>
+      <w:r>
+        <w:t xml:space="preserve">or forensics or if it uses an unreasonable amount of resources. </w:t>
       </w:r>
     </w:p>
     <w:p/>
@@ -206,7 +244,52 @@
     </w:p>
     <w:p>
       <w:r>
-        <w:t xml:space="preserve">The main deliverable for this project will be a research report and </w:t>
+        <w:t xml:space="preserve">The main deliverable for this project will be a research report </w:t>
+      </w:r>
+      <w:r>
+        <w:t>t</w:t>
+      </w:r>
+      <w:r>
+        <w:t>hat discusses our working output and analysis f</w:t>
+      </w:r>
+      <w:r>
+        <w:t>or every</w:t>
+      </w:r>
+      <w:r>
+        <w:t xml:space="preserve"> file that we have tested our tools </w:t>
+      </w:r>
+      <w:r>
+        <w:t xml:space="preserve">and </w:t>
+      </w:r>
+      <w:r>
+        <w:t xml:space="preserve">locally hosted AI </w:t>
+      </w:r>
+      <w:r>
+        <w:t>on and the resulting output of our findings.</w:t>
+      </w:r>
+      <w:r>
+        <w:t xml:space="preserve"> </w:t>
+      </w:r>
+      <w:r>
+        <w:t xml:space="preserve">The deliverables will also include </w:t>
+      </w:r>
+      <w:r>
+        <w:t xml:space="preserve">either a live </w:t>
+      </w:r>
+      <w:r>
+        <w:t xml:space="preserve">demonstration </w:t>
+      </w:r>
+      <w:r>
+        <w:t xml:space="preserve">or a video </w:t>
+      </w:r>
+      <w:r>
+        <w:t xml:space="preserve">demonstration depending on the </w:t>
+      </w:r>
+      <w:r>
+        <w:t xml:space="preserve">viability of </w:t>
+      </w:r>
+      <w:r>
+        <w:t xml:space="preserve">what is included within it. </w:t>
       </w:r>
     </w:p>
     <w:p/>
@@ -216,23 +299,98 @@
         <w:pStyle w:val="Heading2"/>
       </w:pPr>
       <w:r>
+        <w:lastRenderedPageBreak/>
         <w:t>Discussion of project must haves</w:t>
       </w:r>
     </w:p>
     <w:p>
-      <w:r>
+      <w:pPr>
+        <w:rPr>
+          <w:highlight w:val="yellow"/>
+        </w:rPr>
+      </w:pPr>
+      <w:r>
+        <w:rPr>
+          <w:highlight w:val="yellow"/>
+        </w:rPr>
         <w:t>As part of the project discussion, there needs to be a clear discussion of the project “must haves”.</w:t>
       </w:r>
     </w:p>
     <w:p>
       <w:r>
+        <w:rPr>
+          <w:highlight w:val="yellow"/>
+        </w:rPr>
         <w:t>Your Final Panel will expect clear discussion on how each of these “must haves” were met during</w:t>
       </w:r>
       <w:r>
+        <w:rPr>
+          <w:highlight w:val="yellow"/>
+        </w:rPr>
         <w:t xml:space="preserve"> </w:t>
       </w:r>
       <w:r>
+        <w:rPr>
+          <w:highlight w:val="yellow"/>
+        </w:rPr>
         <w:t>your project.</w:t>
+      </w:r>
+    </w:p>
+    <w:p/>
+    <w:p>
+      <w:r>
+        <w:t xml:space="preserve">The main project ‘must have’ is proving that both types of tools can be run on one machine and </w:t>
+      </w:r>
+      <w:r>
+        <w:t xml:space="preserve">having a test plan that </w:t>
+      </w:r>
+      <w:r>
+        <w:t xml:space="preserve">can be completed by both types of </w:t>
+      </w:r>
+      <w:r>
+        <w:t>tools</w:t>
+      </w:r>
+      <w:r>
+        <w:t xml:space="preserve">. </w:t>
+      </w:r>
+      <w:r>
+        <w:t xml:space="preserve">It is important that the final report includes a discussion on what </w:t>
+      </w:r>
+      <w:r>
+        <w:t xml:space="preserve">sections of the forensic process have been impacted the most by Artificial Intelligence and </w:t>
+      </w:r>
+      <w:r>
+        <w:t xml:space="preserve">what makes it worth using the resources. </w:t>
+      </w:r>
+      <w:r>
+        <w:t>This discussion must also include wh</w:t>
+      </w:r>
+      <w:r>
+        <w:t xml:space="preserve">y exactly it is worth it </w:t>
+      </w:r>
+      <w:r>
+        <w:t xml:space="preserve">or not worth it, </w:t>
+      </w:r>
+      <w:r>
+        <w:t xml:space="preserve">to </w:t>
+      </w:r>
+      <w:r>
+        <w:t>invest</w:t>
+      </w:r>
+      <w:r>
+        <w:t xml:space="preserve"> in</w:t>
+      </w:r>
+      <w:r>
+        <w:t xml:space="preserve"> the resources</w:t>
+      </w:r>
+      <w:r>
+        <w:t xml:space="preserve"> </w:t>
+      </w:r>
+      <w:r>
+        <w:t>into using</w:t>
+      </w:r>
+      <w:r>
+        <w:t xml:space="preserve"> AI. </w:t>
       </w:r>
     </w:p>
     <w:p/>
@@ -241,27 +399,190 @@
         <w:pStyle w:val="Heading2"/>
       </w:pPr>
       <w:r>
-        <w:lastRenderedPageBreak/>
         <w:t>Discussion of project nice to haves</w:t>
       </w:r>
     </w:p>
     <w:p>
       <w:r>
+        <w:rPr>
+          <w:highlight w:val="yellow"/>
+        </w:rPr>
         <w:t>As part of the project deliverables discussion, there needs to be a clear discussion of the project “nice</w:t>
       </w:r>
       <w:r>
+        <w:rPr>
+          <w:highlight w:val="yellow"/>
+        </w:rPr>
         <w:t xml:space="preserve"> </w:t>
       </w:r>
       <w:r>
+        <w:rPr>
+          <w:highlight w:val="yellow"/>
+        </w:rPr>
         <w:t>to haves”. These can include “stretch goals” or reasonable “big picture” items that may not necessarily</w:t>
       </w:r>
       <w:r>
+        <w:rPr>
+          <w:highlight w:val="yellow"/>
+        </w:rPr>
         <w:t xml:space="preserve"> </w:t>
       </w:r>
       <w:r>
+        <w:rPr>
+          <w:highlight w:val="yellow"/>
+        </w:rPr>
         <w:t>be delivered in the final product.</w:t>
       </w:r>
     </w:p>
+    <w:p/>
+    <w:p>
+      <w:r>
+        <w:t xml:space="preserve">The ethicality and </w:t>
+      </w:r>
+      <w:r>
+        <w:t xml:space="preserve">risks of data leakage </w:t>
+      </w:r>
+      <w:r>
+        <w:t>ar</w:t>
+      </w:r>
+      <w:r>
+        <w:t xml:space="preserve">en’t necessarily included in the scope of </w:t>
+      </w:r>
+      <w:r>
+        <w:t xml:space="preserve">the project but would be </w:t>
+      </w:r>
+      <w:r>
+        <w:t>considered a “nice</w:t>
+      </w:r>
+      <w:r>
+        <w:t xml:space="preserve"> </w:t>
+      </w:r>
+      <w:r>
+        <w:t>to</w:t>
+      </w:r>
+      <w:r>
+        <w:t xml:space="preserve"> </w:t>
+      </w:r>
+      <w:r>
+        <w:t xml:space="preserve">have” </w:t>
+      </w:r>
+      <w:r>
+        <w:t xml:space="preserve">in the final version. Other </w:t>
+      </w:r>
+      <w:r>
+        <w:t>‘luxuries’</w:t>
+      </w:r>
+      <w:r>
+        <w:t xml:space="preserve"> would include testing on larger </w:t>
+      </w:r>
+      <w:r>
+        <w:t>models;</w:t>
+      </w:r>
+      <w:r>
+        <w:t xml:space="preserve"> </w:t>
+      </w:r>
+      <w:r>
+        <w:t>however,</w:t>
+      </w:r>
+      <w:r>
+        <w:t xml:space="preserve"> this does come at the cost of requiring more equipment such as </w:t>
+      </w:r>
+      <w:r>
+        <w:t xml:space="preserve">higher-end </w:t>
+      </w:r>
+      <w:r>
+        <w:t>GPUs</w:t>
+      </w:r>
+      <w:r>
+        <w:t xml:space="preserve"> with more memory. </w:t>
+      </w:r>
+      <w:r>
+        <w:t>Therefore, b</w:t>
+      </w:r>
+      <w:r>
+        <w:t xml:space="preserve">eing able to </w:t>
+      </w:r>
+      <w:r>
+        <w:t xml:space="preserve">test on a setup with 2 graphics cards is considered </w:t>
+      </w:r>
+      <w:r>
+        <w:t xml:space="preserve">superfluous but </w:t>
+      </w:r>
+      <w:r>
+        <w:t xml:space="preserve">will be excellent to include if we are able to manage that. </w:t>
+      </w:r>
+    </w:p>
+    <w:p>
+      <w:r>
+        <w:t xml:space="preserve">It is also of mention that </w:t>
+      </w:r>
+      <w:r>
+        <w:t>one of the outputs you could expect with more technology available</w:t>
+      </w:r>
+      <w:r>
+        <w:t xml:space="preserve">, is </w:t>
+      </w:r>
+      <w:r>
+        <w:t xml:space="preserve">the ability to see if </w:t>
+      </w:r>
+      <w:r>
+        <w:t>the larger model output is worth the extra resources invested. Th</w:t>
+      </w:r>
+      <w:r>
+        <w:t xml:space="preserve">is is due to the fact that accuracy is a very important factor in the production of a forensics </w:t>
+      </w:r>
+      <w:r>
+        <w:t>report</w:t>
+      </w:r>
+      <w:r>
+        <w:t>.</w:t>
+      </w:r>
+      <w:r>
+        <w:t xml:space="preserve"> </w:t>
+      </w:r>
+      <w:r>
+        <w:t xml:space="preserve">Having the ability to tell if </w:t>
+      </w:r>
+      <w:r>
+        <w:t xml:space="preserve">more resources invested leads to a higher </w:t>
+      </w:r>
+      <w:r>
+        <w:t xml:space="preserve">degree of usefulness/quality from the AI, would be helpful. </w:t>
+      </w:r>
+    </w:p>
+    <w:p>
+      <w:r>
+        <w:t xml:space="preserve">Another extra addition to the project </w:t>
+      </w:r>
+      <w:r>
+        <w:t xml:space="preserve">could be an environment or scripts that help to automate certain activities. </w:t>
+      </w:r>
+      <w:r>
+        <w:t xml:space="preserve">If it is within our capability, </w:t>
+      </w:r>
+      <w:r>
+        <w:t xml:space="preserve">having </w:t>
+      </w:r>
+      <w:r>
+        <w:t>a record</w:t>
+      </w:r>
+      <w:r>
+        <w:t xml:space="preserve"> that data is not leaving the network by tracking the flow of </w:t>
+      </w:r>
+      <w:r>
+        <w:t>packets</w:t>
+      </w:r>
+      <w:r>
+        <w:t xml:space="preserve"> from the computer during the extent of this project is also </w:t>
+      </w:r>
+      <w:r>
+        <w:t>something that can be considered</w:t>
+      </w:r>
+      <w:r>
+        <w:t xml:space="preserve"> as a stretch goal. </w:t>
+      </w:r>
+    </w:p>
+    <w:p/>
     <w:p/>
     <w:p>
       <w:pPr>
@@ -273,10 +594,27 @@
     </w:p>
     <w:p>
       <w:r>
+        <w:rPr>
+          <w:highlight w:val="yellow"/>
+        </w:rPr>
         <w:t>Brief discussion of what is in scope and what is out of scope for the project.</w:t>
       </w:r>
     </w:p>
     <w:p/>
+    <w:p>
+      <w:r>
+        <w:t xml:space="preserve">The development of our own tools for forensics purposes isn’t considered within the scope of the </w:t>
+      </w:r>
+      <w:r>
+        <w:t>project;</w:t>
+      </w:r>
+      <w:r>
+        <w:t xml:space="preserve"> we will be using publicly available ones instead. </w:t>
+      </w:r>
+      <w:r>
+        <w:t xml:space="preserve">Ethics and risks of data leakages while considered a nice to have inclusion, are still considered to be outside the scope of this project. </w:t>
+      </w:r>
+    </w:p>
     <w:p/>
     <w:p>
       <w:pPr>
@@ -940,6 +1278,7 @@
   <w:style w:type="character" w:default="1" w:styleId="DefaultParagraphFont">
     <w:name w:val="Default Paragraph Font"/>
     <w:uiPriority w:val="1"/>
+    <w:semiHidden/>
     <w:unhideWhenUsed/>
   </w:style>
   <w:style w:type="table" w:default="1" w:styleId="TableNormal">

</xml_diff>

<commit_message>
Updating project objective document
</commit_message>
<xml_diff>
--- a/Proposal working/Project Objective Olivia Hey.docx
+++ b/Proposal working/Project Objective Olivia Hey.docx
@@ -36,18 +36,10 @@
     </w:p>
     <w:p>
       <w:r>
-        <w:t xml:space="preserve">Very briefly describe who the client </w:t>
-      </w:r>
-      <w:proofErr w:type="gramStart"/>
-      <w:r>
-        <w:t xml:space="preserve">is, </w:t>
-      </w:r>
-      <w:r>
-        <w:t>and</w:t>
-      </w:r>
-      <w:proofErr w:type="gramEnd"/>
-      <w:r>
-        <w:t xml:space="preserve"> briefly discuss the key problem they want solved.</w:t>
+        <w:t xml:space="preserve">Very briefly describe who the client is, </w:t>
+      </w:r>
+      <w:r>
+        <w:t>and briefly discuss the key problem they want solved.</w:t>
       </w:r>
     </w:p>
     <w:p/>
@@ -600,6 +592,59 @@
         <w:t>Brief discussion of what is in scope and what is out of scope for the project.</w:t>
       </w:r>
     </w:p>
+    <w:p>
+      <w:r>
+        <w:t xml:space="preserve">Tools that can be run in the Kali Linux environment for the </w:t>
+      </w:r>
+      <w:r>
+        <w:t>intended uses of performing digital forensics against publicly available</w:t>
+      </w:r>
+      <w:r>
+        <w:t xml:space="preserve"> datasets are within the scope of this project.</w:t>
+      </w:r>
+      <w:r>
+        <w:t xml:space="preserve"> Forensic testing and analysis will be performed on</w:t>
+      </w:r>
+      <w:r>
+        <w:t xml:space="preserve"> </w:t>
+      </w:r>
+      <w:r>
+        <w:t>OS and mobile-based datasets</w:t>
+      </w:r>
+      <w:r>
+        <w:t xml:space="preserve">. As forensics expands a wide variety of activities such as data-carving, </w:t>
+      </w:r>
+      <w:r>
+        <w:t xml:space="preserve">memory forensics and </w:t>
+      </w:r>
+      <w:r>
+        <w:t xml:space="preserve">network forensics, these will all be considered in-scope for this project as we are looking to test these tools against a variety of different datasets </w:t>
+      </w:r>
+      <w:r>
+        <w:t>to display their strengths and weaknesses.</w:t>
+      </w:r>
+      <w:r>
+        <w:t xml:space="preserve"> </w:t>
+      </w:r>
+      <w:r>
+        <w:t xml:space="preserve"> </w:t>
+      </w:r>
+      <w:r>
+        <w:t xml:space="preserve">The testing of legacy </w:t>
+      </w:r>
+      <w:r>
+        <w:t xml:space="preserve">forensics tools and tools that are aided by artificial intelligence are in scope as we are </w:t>
+      </w:r>
+      <w:r>
+        <w:t xml:space="preserve">looking to compare the </w:t>
+      </w:r>
+      <w:r>
+        <w:t xml:space="preserve">two types of tool. </w:t>
+      </w:r>
+      <w:r>
+        <w:t xml:space="preserve">The analysis and documentation of said testing is also within scope. </w:t>
+      </w:r>
+    </w:p>
     <w:p/>
     <w:p>
       <w:r>
@@ -614,8 +659,36 @@
       <w:r>
         <w:t xml:space="preserve">Ethics and risks of data leakages while considered a nice to have inclusion, are still considered to be outside the scope of this project. </w:t>
       </w:r>
-    </w:p>
-    <w:p/>
+      <w:r>
+        <w:t xml:space="preserve">Cloud-based tools are </w:t>
+      </w:r>
+      <w:r>
+        <w:t xml:space="preserve">also </w:t>
+      </w:r>
+      <w:r>
+        <w:t>out of scope</w:t>
+      </w:r>
+      <w:r>
+        <w:t xml:space="preserve">, this is because the machine we will be working on is a locally hosted machine on a local network. </w:t>
+      </w:r>
+      <w:r>
+        <w:t xml:space="preserve">Digital forensics is usually categorised in within incident response, we are strictly doing the forensics side of IRDF, we will only be testing </w:t>
+      </w:r>
+      <w:r>
+        <w:t xml:space="preserve">on previously available datasets </w:t>
+      </w:r>
+      <w:r>
+        <w:t xml:space="preserve">as we are not responding to any incident nor </w:t>
+      </w:r>
+      <w:r>
+        <w:t xml:space="preserve">are performing forensics for any third party besides our client, Geoff Gordon. </w:t>
+      </w:r>
+    </w:p>
+    <w:p>
+      <w:pPr>
+        <w:pStyle w:val="Heading1"/>
+      </w:pPr>
+    </w:p>
     <w:p>
       <w:pPr>
         <w:pStyle w:val="Heading1"/>

</xml_diff>